<commit_message>
Update report appendix with comment-free source
</commit_message>
<xml_diff>
--- a/Test_Case_Report.docx
+++ b/Test_Case_Report.docx
@@ -541,118 +541,6 @@
           <w:sz w:val="16"/>
           <w:szCs w:val="16"/>
         </w:rPr>
-        <w:t xml:space="preserve">/**</w:t>
-        <w:br/>
-      </w:r>
-      <w:r>
-        <w:rPr>
-          <w:sz w:val="16"/>
-          <w:szCs w:val="16"/>
-        </w:rPr>
-        <w:t xml:space="preserve"> * Organization X - Employee Management and Payroll System.</w:t>
-        <w:br/>
-      </w:r>
-      <w:r>
-        <w:rPr>
-          <w:sz w:val="16"/>
-          <w:szCs w:val="16"/>
-        </w:rPr>
-        <w:t xml:space="preserve"> *</w:t>
-        <w:br/>
-      </w:r>
-      <w:r>
-        <w:rPr>
-          <w:sz w:val="16"/>
-          <w:szCs w:val="16"/>
-        </w:rPr>
-        <w:t xml:space="preserve"> * One file holding both the program under test and its 20 automated test cases</w:t>
-        <w:br/>
-      </w:r>
-      <w:r>
-        <w:rPr>
-          <w:sz w:val="16"/>
-          <w:szCs w:val="16"/>
-        </w:rPr>
-        <w:t xml:space="preserve"> * (10 black-box, 10 white-box). Run it to execute the tests.</w:t>
-        <w:br/>
-      </w:r>
-      <w:r>
-        <w:rPr>
-          <w:sz w:val="16"/>
-          <w:szCs w:val="16"/>
-        </w:rPr>
-        <w:t xml:space="preserve"> *</w:t>
-        <w:br/>
-      </w:r>
-      <w:r>
-        <w:rPr>
-          <w:sz w:val="16"/>
-          <w:szCs w:val="16"/>
-        </w:rPr>
-        <w:t xml:space="preserve"> * Pay rules:</w:t>
-        <w:br/>
-      </w:r>
-      <w:r>
-        <w:rPr>
-          <w:sz w:val="16"/>
-          <w:szCs w:val="16"/>
-        </w:rPr>
-        <w:t xml:space="preserve"> *   hourly rate = salary / 160;  overtime = overtime hours * hourly rate * 1.5</w:t>
-        <w:br/>
-      </w:r>
-      <w:r>
-        <w:rPr>
-          <w:sz w:val="16"/>
-          <w:szCs w:val="16"/>
-        </w:rPr>
-        <w:t xml:space="preserve"> *   gross pay   = regular pay + overtime pay</w:t>
-        <w:br/>
-      </w:r>
-      <w:r>
-        <w:rPr>
-          <w:sz w:val="16"/>
-          <w:szCs w:val="16"/>
-        </w:rPr>
-        <w:t xml:space="preserve"> *   bonus       = 10% of gross pay for Management, else 0</w:t>
-        <w:br/>
-      </w:r>
-      <w:r>
-        <w:rPr>
-          <w:sz w:val="16"/>
-          <w:szCs w:val="16"/>
-        </w:rPr>
-        <w:t xml:space="preserve"> *   taxable pay = gross pay + bonus</w:t>
-        <w:br/>
-      </w:r>
-      <w:r>
-        <w:rPr>
-          <w:sz w:val="16"/>
-          <w:szCs w:val="16"/>
-        </w:rPr>
-        <w:t xml:space="preserve"> *   tax         = 25% of taxable pay when it is &gt;= 5000, else 15%</w:t>
-        <w:br/>
-      </w:r>
-      <w:r>
-        <w:rPr>
-          <w:sz w:val="16"/>
-          <w:szCs w:val="16"/>
-        </w:rPr>
-        <w:t xml:space="preserve"> *   net pay     = taxable pay - tax</w:t>
-        <w:br/>
-      </w:r>
-      <w:r>
-        <w:rPr>
-          <w:sz w:val="16"/>
-          <w:szCs w:val="16"/>
-        </w:rPr>
-        <w:t xml:space="preserve"> */</w:t>
-        <w:br/>
-      </w:r>
-      <w:r>
-        <w:rPr>
-          <w:sz w:val="16"/>
-          <w:szCs w:val="16"/>
-        </w:rPr>
         <w:t xml:space="preserve">public class EmployeeManagementSystem {</w:t>
         <w:br/>
       </w:r>
@@ -1966,38 +1854,6 @@
           <w:szCs w:val="16"/>
         </w:rPr>
         <w:t xml:space="preserve">    }</w:t>
-        <w:br/>
-      </w:r>
-      <w:r>
-        <w:rPr>
-          <w:sz w:val="16"/>
-          <w:szCs w:val="16"/>
-        </w:rPr>
-        <w:t xml:space="preserve"/>
-        <w:br/>
-      </w:r>
-      <w:r>
-        <w:rPr>
-          <w:sz w:val="16"/>
-          <w:szCs w:val="16"/>
-        </w:rPr>
-        <w:t xml:space="preserve">    // ------------------------------------------------------------------</w:t>
-        <w:br/>
-      </w:r>
-      <w:r>
-        <w:rPr>
-          <w:sz w:val="16"/>
-          <w:szCs w:val="16"/>
-        </w:rPr>
-        <w:t xml:space="preserve">    // Test suite: 10 black-box cases followed by 10 white-box cases.</w:t>
-        <w:br/>
-      </w:r>
-      <w:r>
-        <w:rPr>
-          <w:sz w:val="16"/>
-          <w:szCs w:val="16"/>
-        </w:rPr>
-        <w:t xml:space="preserve">    // ------------------------------------------------------------------</w:t>
         <w:br/>
       </w:r>
       <w:r>

</xml_diff>